<commit_message>
Update activity log for 2026-07-31 report: increment follow-ups and add detailed follow-up entry for Mike Morris at Travel Butler.
</commit_message>
<xml_diff>
--- a/proposals/ElectroCom-LORiMDT-RFI-Response.docx
+++ b/proposals/ElectroCom-LORiMDT-RFI-Response.docx
@@ -18,7 +18,7 @@
         <w:t>Submitted to:</w:t>
       </w:r>
       <w:r>
-        <w:t xml:space="preserve"> Casi M. Vician, Chief Technology Architect, Lucas Health Tech (casi@lucashealthtech.com)</w:t>
+        <w:t xml:space="preserve"> Casi M. Vician, Founder &amp; CEO, Lucas Health Tech (casi@lucashealthtech.com)</w:t>
       </w:r>
     </w:p>
     <w:p>
@@ -102,7 +102,7 @@
     </w:p>
     <w:p>
       <w:r>
-        <w:t>ElectroCom trades as ElectroCom (legal entity ElectroCom Innovations LLC), a US-registered company founded in 1998 with 28 years in technology, from telecom infrastructure into full-stack software, data, and AI/ML delivery. Headquarters: 2750 S Preston Rd, Ste 1167, Celina, TX 75009. Delivery office: Multan, Pakistan. Team: 11+ across engineering, data science, and DevOps, of whom 6 have worked on our current healthcare SaaS engagement. We are privately held and services-profitable; we are not disclosing revenue figures at the RFI stage. We run US-based production governance with a dedicated delivery team offshore, which is the onshore-production and offshore-development structure your FAQ Q59 describes as acceptable. The PHI controls are in Section 2.4.</w:t>
+        <w:t>ElectroCom trades as ElectroCom (legal entity ElectroCom Innovations LLC), a US-registered company founded in 1998 with 28 years in technology, from telecom infrastructure into full-stack software, data, and AI/ML delivery. Headquarters: 2750 S Preston Rd, Ste 1167, Celina, TX 75009. Team: 11+ across engineering, data science, and DevOps, of whom 6 have worked on our current healthcare SaaS engagement. We are privately held and services-profitable; we are not disclosing revenue figures at the RFI stage. Our PHI controls and data-residency approach are in Section 2.4.</w:t>
       </w:r>
     </w:p>
     <w:p>
@@ -128,7 +128,7 @@
     </w:p>
     <w:p>
       <w:r>
-        <w:t>Our directly comparable experience is the clinical-platform engagement above. It began as a modernization of a legacy desktop clinical application that had run hospital lab workflows for over a decade, and we rebuilt it module by module into a production React cloud application while the platform stayed live for its hospital users. It now runs across hospitals in Australia and the UK and covers patient records, clinical quality control and reporting, appointment scheduling, and staff rostering, on real clinical data. The program ran about 20 months and never took the clinical service offline, which is the same constraint LORiMDT carries: you cannot pause a live clinical service to modernize it. See Appendix B for a fuller write-up.</w:t>
+        <w:t>Our directly comparable experience is the clinical-platform engagement above. It began as a modernization of a legacy desktop clinical application that had run hospital lab workflows for over a decade, and we rebuilt it module by module into a production React cloud application while the platform stayed live for its hospital users. It now runs across hospitals in Australia and the UK and covers patient records, clinical quality control, structured clinical reporting and diagnostic-report analysis, appointment scheduling, and staff rostering, on real clinical data. Our data team has hands-on experience turning clinical reports into structured, analyzable data, which maps directly to LORiMDT's registry-quality capture. The program ran about 20 months and never took the clinical service offline, which is the same constraint LORiMDT carries: you cannot pause a live clinical service to modernize it. See Appendix B for a fuller write-up.</w:t>
       </w:r>
     </w:p>
     <w:p>
@@ -405,7 +405,7 @@
     </w:p>
     <w:p>
       <w:r>
-        <w:t>We will be direct: ElectroCom does not currently hold SOC 2 Type II, HITRUST, or ISO 27001. We are not going to present a certification portfolio we do not have, because it would not survive the demo and reference stage. What we do is build to the controls those frameworks specify (encryption, least-privilege access, audit logging, change management, and BAAs), and we will commit contractually to achieving SOC 2 Type II within 12 months of contract signing, with ISO 27001 for our offshore delivery operation on a similar horizon. If a certification is a hard gate for you at pilot, tell us and we will scope the timeline and cost into the proposal directly rather than around it.</w:t>
+        <w:t>We will be direct: ElectroCom does not currently hold SOC 2 Type II, HITRUST, or ISO 27001. What we do is build to the controls those frameworks specify (encryption, least-privilege access, audit logging, change management, and BAAs), and we will commit contractually to achieving SOC 2 Type II within 12 months of contract signing, with ISO 27001 for our delivery operations on a similar horizon. If a certification is a hard gate for you at pilot, tell us and we will scope the timeline and cost into the proposal directly rather than around it.</w:t>
       </w:r>
     </w:p>
     <w:p>
@@ -444,7 +444,7 @@
     </w:p>
     <w:p>
       <w:r>
-        <w:t>Yes, we guarantee US-based data residency for production PHI: the application, its data, and its authentication endpoints reside in US AWS regions, enforced by hosting and network controls (your FAQ Q48). Disclosure, per your FAQ Q57 and Q59: production PHI is accessed only by US-based production and DevOps roles. Our development and testing team in Multan, Pakistan works against de-identified or synthetic data only and does not access production PHI, under least-privilege controls and the confidentiality terms of the engagement. This is the onshore-production and offshore-development split your FAQ Q59 blesses, and we will document the technical and contractual controls that keep PHI onshore.</w:t>
+        <w:t>Yes, we guarantee US-based data residency for production PHI: the application, its data, and its authentication endpoints reside in US AWS regions, enforced by hosting and network controls (your FAQ Q48). Disclosure, per your FAQ Q57 and Q59: production PHI is accessed only by US-based production and DevOps roles. Our development and testing team, which works from outside the United States, accesses only de-identified or synthetic data and never production PHI, under least-privilege controls and the confidentiality terms of the engagement. This is the onshore-production and offshore-development split your FAQ Q59 blesses, and we will document the technical and contractual controls that keep PHI onshore.</w:t>
       </w:r>
     </w:p>
     <w:p>
@@ -609,11 +609,6 @@
       </w:pPr>
       <w:r>
         <w:t>Clinical and product liaison working directly with your BA/product owner and Dr. Baker's group.</w:t>
-      </w:r>
-    </w:p>
-    <w:p>
-      <w:r>
-        <w:t>Locations and PHI access per Q26: US-based production governance, offshore development on synthetic and de-identified data.</w:t>
       </w:r>
     </w:p>
     <w:p>
@@ -1202,12 +1197,12 @@
         <w:pStyle w:val="Heading2"/>
       </w:pPr>
       <w:r>
-        <w:t>Appendix A. Architecture diagram</w:t>
+        <w:t>Appendix A. Architecture</w:t>
       </w:r>
     </w:p>
     <w:p>
       <w:r>
-        <w:t>Multi-tenant US AWS deployment, FHIR integration layer, and the three-tier capture model. [add diagram if time allows; optional]</w:t>
+        <w:t>Multi-tenant US AWS deployment, FHIR integration layer, and the three-tier capture model.</w:t>
       </w:r>
     </w:p>
     <w:p>

</xml_diff>

<commit_message>
Add Electrocom logo image to proposals directory
</commit_message>
<xml_diff>
--- a/proposals/ElectroCom-LORiMDT-RFI-Response.docx
+++ b/proposals/ElectroCom-LORiMDT-RFI-Response.docx
@@ -2,6 +2,45 @@
 <file path=word/document.xml><?xml version="1.0" encoding="utf-8"?>
 <w:document xmlns:wpc="http://schemas.microsoft.com/office/word/2010/wordprocessingCanvas" xmlns:mo="http://schemas.microsoft.com/office/mac/office/2008/main" xmlns:mc="http://schemas.openxmlformats.org/markup-compatibility/2006" xmlns:mv="urn:schemas-microsoft-com:mac:vml" xmlns:o="urn:schemas-microsoft-com:office:office" xmlns:r="http://schemas.openxmlformats.org/officeDocument/2006/relationships" xmlns:m="http://schemas.openxmlformats.org/officeDocument/2006/math" xmlns:v="urn:schemas-microsoft-com:vml" xmlns:wp14="http://schemas.microsoft.com/office/word/2010/wordprocessingDrawing" xmlns:wp="http://schemas.openxmlformats.org/drawingml/2006/wordprocessingDrawing" xmlns:w10="urn:schemas-microsoft-com:office:word" xmlns:w="http://schemas.openxmlformats.org/wordprocessingml/2006/main" xmlns:w14="http://schemas.microsoft.com/office/word/2010/wordml" xmlns:wpg="http://schemas.microsoft.com/office/word/2010/wordprocessingGroup" xmlns:wpi="http://schemas.microsoft.com/office/word/2010/wordprocessingInk" xmlns:wne="http://schemas.microsoft.com/office/word/2006/wordml" xmlns:wps="http://schemas.microsoft.com/office/word/2010/wordprocessingShape" mc:Ignorable="w14 wp14">
   <w:body>
+    <w:p>
+      <w:pPr>
+        <w:jc w:val="center"/>
+      </w:pPr>
+      <w:r>
+        <w:drawing>
+          <wp:inline xmlns:a="http://schemas.openxmlformats.org/drawingml/2006/main" xmlns:pic="http://schemas.openxmlformats.org/drawingml/2006/picture">
+            <wp:extent cx="1051560" cy="917486"/>
+            <wp:docPr id="1" name="Picture 1"/>
+            <wp:cNvGraphicFramePr>
+              <a:graphicFrameLocks noChangeAspect="1"/>
+            </wp:cNvGraphicFramePr>
+            <a:graphic>
+              <a:graphicData uri="http://schemas.openxmlformats.org/drawingml/2006/picture">
+                <pic:pic>
+                  <pic:nvPicPr>
+                    <pic:cNvPr id="0" name="electrocom-logo.png"/>
+                    <pic:cNvPicPr/>
+                  </pic:nvPicPr>
+                  <pic:blipFill>
+                    <a:blip r:embed="rId9"/>
+                    <a:stretch>
+                      <a:fillRect/>
+                    </a:stretch>
+                  </pic:blipFill>
+                  <pic:spPr>
+                    <a:xfrm>
+                      <a:off x="0" y="0"/>
+                      <a:ext cx="1051560" cy="917486"/>
+                    </a:xfrm>
+                    <a:prstGeom prst="rect"/>
+                  </pic:spPr>
+                </pic:pic>
+              </a:graphicData>
+            </a:graphic>
+          </wp:inline>
+        </w:drawing>
+      </w:r>
+    </w:p>
     <w:p>
       <w:pPr>
         <w:pStyle w:val="Heading1"/>
@@ -1240,17 +1279,26 @@
     </w:p>
     <w:p>
       <w:r>
-        <w:t>Our closest match to LORiMDT is the client behind the clinical-platform modernization described in Sections 2.1, 8, 9, and Appendix B. We keep that client unnamed in this written response and will make them available as a reference at the demo stage, which is where your process schedules reference checks (August 5 to 7).</w:t>
-      </w:r>
-    </w:p>
-    <w:p>
-      <w:r>
-        <w:t>A healthcare-sector client we can name now:</w:t>
+        <w:t>Healthcare-sector clients we can name now:</w:t>
       </w:r>
     </w:p>
     <w:p>
       <w:r>
         <w:t xml:space="preserve">1. </w:t>
+      </w:r>
+      <w:r>
+        <w:rPr>
+          <w:b/>
+        </w:rPr>
+        <w:t>Sono Stat Imaging (Dallas-Fort Worth, Texas, US).</w:t>
+      </w:r>
+      <w:r>
+        <w:t xml:space="preserve"> A US diagnostic medical-imaging provider covering cardiac, vascular, and general ultrasound. ElectroCom built and maintains their digital platform and operational systems. Contact: Iftikhar Saeed Khan, +1 210-422-0737, sonostatimaging@gmail.com.</w:t>
+      </w:r>
+    </w:p>
+    <w:p>
+      <w:r>
+        <w:t xml:space="preserve">2. </w:t>
       </w:r>
       <w:r>
         <w:rPr>
@@ -1264,7 +1312,12 @@
     </w:p>
     <w:p>
       <w:r>
-        <w:t>We would rather offer two solid references than pad the list, and we can add the clinical-platform client above at the demo stage.</w:t>
+        <w:t>Our closest match to LORiMDT is the clinical-platform client described in Sections 2.1, 8, 9, and Appendix B. We keep that client unnamed in this written response and make them available as a reference at the demo stage, where your process schedules reference checks (August 5 to 7).</w:t>
+      </w:r>
+    </w:p>
+    <w:p>
+      <w:r>
+        <w:t>We also design internal and manufacturing-accuracy systems for health-product manufacturers, including CoreSpeed and PharmaBuilt (nutraceutical and supplement manufacturers; contact John Linss, +1 770-630-9956, jlinss@corespeed.com). We name these as data-integrity and systems-engineering work rather than clinical-workflow references, so each is weighed for what it is. The relevance to LORiMDT is the discipline they share with registry-quality capture: structured data, validation, and traceable accuracy in a regulated setting.</w:t>
       </w:r>
     </w:p>
     <w:p>

</xml_diff>

<commit_message>
Update RFI response document and report with reviewer feedback and formatting enhancements
- Updated the ElectroCom-LORiMDT RFI response PDF to include new footer and page numbering.
- Revised report for 2026-08-01 to document proposal drafting outcomes, including restructuring of content per reviewer feedback and confirmation of document details.
- Added details on named contacts and next actions for follow-up communications.
</commit_message>
<xml_diff>
--- a/proposals/ElectroCom-LORiMDT-RFI-Response.docx
+++ b/proposals/ElectroCom-LORiMDT-RFI-Response.docx
@@ -22,7 +22,7 @@
                     <pic:cNvPicPr/>
                   </pic:nvPicPr>
                   <pic:blipFill>
-                    <a:blip r:embed="rId9"/>
+                    <a:blip r:embed="rId10"/>
                     <a:stretch>
                       <a:fillRect/>
                     </a:stretch>
@@ -167,7 +167,7 @@
     </w:p>
     <w:p>
       <w:r>
-        <w:t>Our directly comparable experience is the clinical-platform engagement above. It began as a modernization of a legacy desktop clinical application that had run hospital lab workflows for over a decade, and we rebuilt it module by module into a production React cloud application while the platform stayed live for its hospital users. It now runs across hospitals in Australia and the UK and covers patient records, clinical quality control, structured clinical reporting and diagnostic-report analysis, appointment scheduling, and staff rostering, on real clinical data. Our data team has hands-on experience turning clinical reports into structured, analyzable data, which maps directly to LORiMDT's registry-quality capture. The program ran about 20 months and never took the clinical service offline, which is the same constraint LORiMDT carries: you cannot pause a live clinical service to modernize it. See Appendix B for a fuller write-up.</w:t>
+        <w:t>Our directly comparable experience is the clinical-platform engagement above. It began as a modernization of a legacy desktop clinical application that had run hospital lab workflows for over a decade, and we rebuilt it module by module into a production React cloud application while the platform stayed live for its hospital users. It now runs across hospitals in Australia and the UK and covers patient records, clinical quality control, structured clinical reporting and diagnostic-report analysis, appointment scheduling, and staff rostering, on real clinical data. Our data team has hands-on experience turning clinical reports into structured, analyzable data, which maps directly to LORiMDT's registry-quality capture. The program ran about 20 months and never took the clinical service offline, which is the same constraint LORiMDT carries: you cannot pause a live clinical service to modernize it. See Appendix A for a fuller write-up.</w:t>
       </w:r>
     </w:p>
     <w:p>
@@ -1279,7 +1279,12 @@
     </w:p>
     <w:p>
       <w:r>
-        <w:t>Healthcare-sector clients we can name now:</w:t>
+        <w:t>Our most comparable reference is a live, multi-hospital clinical platform our team built and runs: structured clinical workflow on real patient data, integration with EHR and legacy systems, and continuous operation across hospitals in Australia and the UK. That client is under confidentiality, so we do not name them in writing. We introduce them directly as a reference at the demo stage, where your process schedules reference checks (August 5 to 7). This is our closest match to LORiMDT in clinical scope, and we would rather have you speak with them under NDA than describe them secondhand here.</w:t>
+      </w:r>
+    </w:p>
+    <w:p>
+      <w:r>
+        <w:t>Two named healthcare clients you can contact now:</w:t>
       </w:r>
     </w:p>
     <w:p>
@@ -1293,7 +1298,7 @@
         <w:t>Sono Stat Imaging (Dallas-Fort Worth, Texas, US).</w:t>
       </w:r>
       <w:r>
-        <w:t xml:space="preserve"> A US diagnostic medical-imaging provider covering cardiac, vascular, and general ultrasound. ElectroCom built and maintains their digital platform and operational systems. Contact: Iftikhar Saeed Khan, +1 210-422-0737, sonostatimaging@gmail.com.</w:t>
+        <w:t xml:space="preserve"> A US healthcare provider delivering physician-referred diagnostic ultrasound to patients: cardiac echocardiography, carotid and vascular Doppler, and abdominal and thyroid imaging, performed by credentialed sonographers and billed through insurance. ElectroCom built and runs the digital platform and operational systems behind their imaging service, the patient-facing and clinical-operations layer they rely on day to day. Contact: Iftikhar Saeed Khan, +1 210-422-0737, sonostatimaging@gmail.com.</w:t>
       </w:r>
     </w:p>
     <w:p>
@@ -1307,17 +1312,12 @@
         <w:t>The Islamia University of Bahawalpur (IUB), Faculty of Medicine and Allied Health Sciences.</w:t>
       </w:r>
       <w:r>
-        <w:t xml:space="preserve"> A public university with a medical faculty and a teaching-hospital partnership (Nawab Sir Sadiq Muhammad Khan Abbasi Hospital). Engagement: ElectroCom built their patient-management system. Contact: IT Director, +92 300 9635022.</w:t>
+        <w:t xml:space="preserve"> A university medical faculty with a teaching-hospital partner (Nawab Sir Sadiq Muhammad Khan Abbasi Hospital). ElectroCom built their clinical patient-management system. Contact: IT Director, +92 300 9635022.</w:t>
       </w:r>
     </w:p>
     <w:p>
       <w:r>
-        <w:t>Our closest match to LORiMDT is the clinical-platform client described in Sections 2.1, 8, 9, and Appendix B. We keep that client unnamed in this written response and make them available as a reference at the demo stage, where your process schedules reference checks (August 5 to 7).</w:t>
-      </w:r>
-    </w:p>
-    <w:p>
-      <w:r>
-        <w:t>We also design internal and manufacturing-accuracy systems for health-product manufacturers, including CoreSpeed and PharmaBuilt (nutraceutical and supplement manufacturers; contact John Linss, +1 770-630-9956, jlinss@corespeed.com). We name these as data-integrity and systems-engineering work rather than clinical-workflow references, so each is weighed for what it is. The relevance to LORiMDT is the discipline they share with registry-quality capture: structured data, validation, and traceable accuracy in a regulated setting.</w:t>
+        <w:t>For completeness, we also build data-integrity and manufacturing-accuracy systems for regulated health-product manufacturers (CoreSpeed and PharmaBuilt; contact John Linss, +1 770-630-9956, jlinss@corespeed.com). We list these as systems-engineering work, not clinical-workflow references, so each is weighed for what it is.</w:t>
       </w:r>
     </w:p>
     <w:p>
@@ -1325,20 +1325,7 @@
         <w:pStyle w:val="Heading2"/>
       </w:pPr>
       <w:r>
-        <w:t>Appendix A. Architecture</w:t>
-      </w:r>
-    </w:p>
-    <w:p>
-      <w:r>
-        <w:t>Multi-tenant US AWS deployment, FHIR integration layer, and the three-tier capture model.</w:t>
-      </w:r>
-    </w:p>
-    <w:p>
-      <w:pPr>
-        <w:pStyle w:val="Heading2"/>
-      </w:pPr>
-      <w:r>
-        <w:t>Appendix B. Case study: legacy clinical platform modernization (client anonymized)</w:t>
+        <w:t>Appendix A. Case study: legacy clinical platform modernization (client anonymized)</w:t>
       </w:r>
     </w:p>
     <w:p>
@@ -1402,6 +1389,7 @@
       </w:r>
     </w:p>
     <w:sectPr>
+      <w:footerReference w:type="default" r:id="rId9"/>
       <w:pgSz w:w="12240" w:h="15840"/>
       <w:pgMar w:top="1440" w:right="1800" w:bottom="1440" w:left="1800" w:header="720" w:footer="720" w:gutter="0"/>
       <w:cols w:space="720"/>
@@ -1409,6 +1397,45 @@
     </w:sectPr>
   </w:body>
 </w:document>
+</file>
+
+<file path=word/footer1.xml><?xml version="1.0" encoding="utf-8"?>
+<w:ftr xmlns:m="http://schemas.openxmlformats.org/officeDocument/2006/math" xmlns:mc="http://schemas.openxmlformats.org/markup-compatibility/2006" xmlns:mo="http://schemas.microsoft.com/office/mac/office/2008/main" xmlns:mv="urn:schemas-microsoft-com:mac:vml" xmlns:o="urn:schemas-microsoft-com:office:office" xmlns:r="http://schemas.openxmlformats.org/officeDocument/2006/relationships" xmlns:v="urn:schemas-microsoft-com:vml" xmlns:w10="urn:schemas-microsoft-com:office:word" xmlns:w14="http://schemas.microsoft.com/office/word/2010/wordml" xmlns:w="http://schemas.openxmlformats.org/wordprocessingml/2006/main" xmlns:wne="http://schemas.microsoft.com/office/word/2006/wordml" xmlns:wp14="http://schemas.microsoft.com/office/word/2010/wordprocessingDrawing" xmlns:wp="http://schemas.openxmlformats.org/drawingml/2006/wordprocessingDrawing" xmlns:wpc="http://schemas.microsoft.com/office/word/2010/wordprocessingCanvas" xmlns:wpg="http://schemas.microsoft.com/office/word/2010/wordprocessingGroup" xmlns:wpi="http://schemas.microsoft.com/office/word/2010/wordprocessingInk" xmlns:wps="http://schemas.microsoft.com/office/word/2010/wordprocessingShape" mc:Ignorable="w14 wp14">
+  <w:p>
+    <w:pPr>
+      <w:pStyle w:val="Footer"/>
+      <w:jc w:val="center"/>
+    </w:pPr>
+    <w:r>
+      <w:rPr>
+        <w:sz w:val="16"/>
+      </w:rPr>
+      <w:t xml:space="preserve">ElectroCom · LORiMDT RFI Response · Confidential · Page </w:t>
+    </w:r>
+    <w:r>
+      <w:rPr>
+        <w:sz w:val="16"/>
+      </w:rPr>
+      <w:fldChar w:fldCharType="begin"/>
+      <w:instrText xml:space="preserve"> PAGE </w:instrText>
+      <w:fldChar w:fldCharType="end"/>
+    </w:r>
+    <w:r>
+      <w:rPr>
+        <w:sz w:val="16"/>
+      </w:rPr>
+      <w:t xml:space="preserve"> of </w:t>
+    </w:r>
+    <w:r>
+      <w:rPr>
+        <w:sz w:val="16"/>
+      </w:rPr>
+      <w:fldChar w:fldCharType="begin"/>
+      <w:instrText xml:space="preserve"> NUMPAGES </w:instrText>
+      <w:fldChar w:fldCharType="end"/>
+    </w:r>
+  </w:p>
+</w:ftr>
 </file>
 
 <file path=word/numbering.xml><?xml version="1.0" encoding="utf-8"?>

</xml_diff>